<commit_message>
fix(legal-docs): use Level 19 and admin@cashsouk.com in FA and DOA
Legal's October review found the generated Facility Agreement and Deed of
Assignment still listing the operator email as hellosuyula@shorakagroup.com,
and the DOA Schedule 1 SSP address as Level 17. Updates the text and mailto
links in the tagged templates and their clean copies, so rerunning the retag
scripts keeps the fix. Bumps both catalog versions for the evidence trail.

Refs: https://app.notion.com/p/3f26d1eef72a817c90f2cc69face1acd
</commit_message>
<xml_diff>
--- a/apps/api/src/modules/applications/templates/Deed of Assignment - Cashsouk.docx
+++ b/apps/api/src/modules/applications/templates/Deed of Assignment - Cashsouk.docx
@@ -112,7 +112,7 @@
           <w:sz w:val="20"/>
           <w:szCs w:val="20"/>
         </w:rPr>
-        <w:t xml:space="preserve">, a company incorporated in Malaysia with its principal place of business at Level 17, Wisma Mont’ Kiara, No. 1, Jalan Kiara, Mont’ Kiara, 50480 Kuala Lumpur, Malaysia and with an electronic mail address at </w:t>
+        <w:t xml:space="preserve">, a company incorporated in Malaysia with its principal place of business at Level 19, Wisma Mont’ Kiara, No. 1, Jalan Kiara, Mont’ Kiara, 50480 Kuala Lumpur, Malaysia and with an electronic mail address at </w:t>
       </w:r>
       <w:hyperlink r:id="rId8" w:history="1">
         <w:r>
@@ -122,7 +122,7 @@
             <w:sz w:val="20"/>
             <w:szCs w:val="20"/>
           </w:rPr>
-          <w:t>hellosuyula@shorakagroup.com</w:t>
+          <w:t>admin@cashsouk.com</w:t>
         </w:r>
       </w:hyperlink>
       <w:r>
@@ -7263,7 +7263,7 @@
                 <w:sz w:val="20"/>
                 <w:szCs w:val="20"/>
               </w:rPr>
-              <w:t>Level 17, Wisma Mont Kiara, Jalan Mont Kiara, 50480 Kuala Lumpur</w:t>
+              <w:t>Level 19, Wisma Mont Kiara, Jalan Mont Kiara, 50480 Kuala Lumpur</w:t>
             </w:r>
           </w:p>
         </w:tc>
@@ -7317,7 +7317,7 @@
                   <w:sz w:val="20"/>
                   <w:szCs w:val="20"/>
                 </w:rPr>
-                <w:t>hellosuyula@shorakagroup.com</w:t>
+                <w:t>admin@cashsouk.com</w:t>
               </w:r>
             </w:hyperlink>
             <w:r>

</xml_diff>